<commit_message>
Agrego mis archivos reales de la actividad
</commit_message>
<xml_diff>
--- a/Documentos/29 de septiembre del 2026.docx
+++ b/Documentos/29 de septiembre del 2026.docx
@@ -51,11 +51,19 @@
         <w:t>"</w:t>
       </w:r>
       <w:proofErr w:type="spellStart"/>
-      <w:r>
-        <w:rPr>
-          <w:lang w:val="en-US"/>
-        </w:rPr>
-        <w:t>uptime_days</w:t>
+      <w:proofErr w:type="gramStart"/>
+      <w:r>
+        <w:rPr>
+          <w:lang w:val="en-US"/>
+        </w:rPr>
+        <w:t>uptime</w:t>
+      </w:r>
+      <w:proofErr w:type="gramEnd"/>
+      <w:r>
+        <w:rPr>
+          <w:lang w:val="en-US"/>
+        </w:rPr>
+        <w:t>_days</w:t>
       </w:r>
       <w:proofErr w:type="spellEnd"/>
       <w:r>
@@ -83,11 +91,19 @@
         <w:t>"</w:t>
       </w:r>
       <w:proofErr w:type="spellStart"/>
-      <w:r>
-        <w:rPr>
-          <w:lang w:val="en-US"/>
-        </w:rPr>
-        <w:t>managed_by_apic</w:t>
+      <w:proofErr w:type="gramStart"/>
+      <w:r>
+        <w:rPr>
+          <w:lang w:val="en-US"/>
+        </w:rPr>
+        <w:t>managed</w:t>
+      </w:r>
+      <w:proofErr w:type="gramEnd"/>
+      <w:r>
+        <w:rPr>
+          <w:lang w:val="en-US"/>
+        </w:rPr>
+        <w:t>_by_apic</w:t>
       </w:r>
       <w:proofErr w:type="spellEnd"/>
       <w:r>

</xml_diff>